<commit_message>
Added DOI to Pre-Immune_Window_Article_EN.docx and pre_immune_window_repo.zip
</commit_message>
<xml_diff>
--- a/Pre-Immune_Window_Article_EN.docx
+++ b/Pre-Immune_Window_Article_EN.docx
@@ -972,7 +972,7 @@
         <w:pStyle w:val="BodyText"/>
       </w:pPr>
       <w:r>
-        <w:t xml:space="preserve">The engine exists in two implementations, synchronized in logic and in the order of random-number-generator calls, so that the results of one can be cross-checked against the other:</w:t>
+        <w:t xml:space="preserve">The engine exists in two implementations. They share the model, the random-number generator and the order of its calls, but differ in one respect: the JavaScript bench gives each cell a territory of one to four lattice nodes, whereas the Python engine holds one cell per node. Runs are therefore cross-checked at the level of outcomes rather than trajectories — the two agree on whether a clone becomes established and on its final size, and disagree on timing:</w:t>
       </w:r>
     </w:p>
     <w:p>
@@ -988,13 +988,26 @@
           <w:bCs/>
           <w:b/>
         </w:rPr>
-        <w:t xml:space="preserve">epithelium_bench.html / epithelium_bench_g033_o02.html</w:t>
-      </w:r>
-      <w:r>
-        <w:t xml:space="preserve"> </w:t>
-      </w:r>
-      <w:r>
-        <w:t xml:space="preserve">— an interactive visual bench in JavaScript with real-time rendering, used for illustration and manual exploration, not for collecting statistics;</w:t>
+        <w:t xml:space="preserve">epithelium_bench.html</w:t>
+      </w:r>
+      <w:r>
+        <w:t xml:space="preserve"> </w:t>
+      </w:r>
+      <w:r>
+        <w:t xml:space="preserve">(and</w:t>
+      </w:r>
+      <w:r>
+        <w:t xml:space="preserve"> </w:t>
+      </w:r>
+      <w:r>
+        <w:rPr>
+          <w:bCs/>
+          <w:b/>
+        </w:rPr>
+        <w:t xml:space="preserve">epithelium_bench_no_o2filter.html</w:t>
+      </w:r>
+      <w:r>
+        <w:t xml:space="preserve">, the earlier build without the oxygen filter) — an interactive visual bench in JavaScript with real-time rendering, used for illustration and manual exploration, not for collecting statistics;</w:t>
       </w:r>
     </w:p>
     <w:p>
@@ -8609,7 +8622,39 @@
       </w:r>
     </w:p>
     <w:bookmarkEnd w:id="104"/>
-    <w:bookmarkStart w:id="105" w:name="Xc2e29f1a0b69972c0d53d9573c2cec1d02300f5"/>
+    <w:bookmarkStart w:id="106" w:name="code-and-data-availability"/>
+    <w:p>
+      <w:pPr>
+        <w:pStyle w:val="Heading1"/>
+      </w:pPr>
+      <w:r>
+        <w:t xml:space="preserve">Code and Data Availability</w:t>
+      </w:r>
+    </w:p>
+    <w:p>
+      <w:pPr>
+        <w:pStyle w:val="FirstParagraph"/>
+      </w:pPr>
+      <w:r>
+        <w:t xml:space="preserve">The simulation engine, the batch runners, the interactive JavaScript bench and the complete run data behind Chapters 1, 2 and 4 — 2,500 runs, one row per run — are archived at Zenodo under DOI</w:t>
+      </w:r>
+      <w:r>
+        <w:t xml:space="preserve"> </w:t>
+      </w:r>
+      <w:hyperlink r:id="rId105">
+        <w:r>
+          <w:rPr>
+            <w:rStyle w:val="Hyperlink"/>
+          </w:rPr>
+          <w:t xml:space="preserve">10.5281/zenodo.23065347</w:t>
+        </w:r>
+      </w:hyperlink>
+      <w:r>
+        <w:t xml:space="preserve">, together with the script that regenerates every figure in this paper from the deposited data. The archive is released under the MIT licence for the code and CC BY 4.0 for the data and figures.</w:t>
+      </w:r>
+    </w:p>
+    <w:bookmarkEnd w:id="106"/>
+    <w:bookmarkStart w:id="107" w:name="Xc2e29f1a0b69972c0d53d9573c2cec1d02300f5"/>
     <w:p>
       <w:pPr>
         <w:pStyle w:val="Heading1"/>
@@ -9102,7 +9147,7 @@
         <w:t xml:space="preserve"> </w:t>
       </w:r>
       <w:r>
-        <w:t xml:space="preserve">Series S0 reproduces five seeds of the existing series exactly and is the first thing to run: any deviation means the engine is not the one that produced the published data. The JavaScript and Python implementations can also be compared directly, since they share the order of random-number-generator calls (see the Introduction to Part I).</w:t>
+        <w:t xml:space="preserve">Series S0 reproduces five seeds of the existing series exactly and is the first thing to run: any deviation means the engine is not the one that produced the published data. The JavaScript and Python implementations can also be compared, at the level of outcomes rather than step-by-step trajectories, for the reason given in the Introduction to Part I.</w:t>
       </w:r>
     </w:p>
     <w:p>
@@ -9123,7 +9168,7 @@
         <w:t xml:space="preserve">The archival run referred to in Section 1.6 (14% establishment without wounding), with its engine version and parameter values stated explicitly. It is kept as a reference point only and is not compared quantitatively with the current engine.</w:t>
       </w:r>
     </w:p>
-    <w:bookmarkEnd w:id="105"/>
+    <w:bookmarkEnd w:id="107"/>
     <w:sectPr/>
   </w:body>
 </w:document>

</xml_diff>